<commit_message>
Percurso cognitivo com personas e correção do campo de quantidade
- formulário seleciona o valor inicial: digitar substitui em vez de concatenar
- KLM atualizado (T2 e T4 com uma tecla a menos)
- relatório: seção 6.5 com relatos simulados (personas), declarados como tal

Co-Authored-By: Claude Opus 5.5 <noreply@anthropic.com>
Claude-Session: https://claude.ai/code/session_01Ra395WfUptUjwP3YxcgdmB
</commit_message>
<xml_diff>
--- a/relatorio/Relatorio_Projeto_Integrador.docx
+++ b/relatorio/Relatorio_Projeto_Integrador.docx
@@ -248,7 +248,7 @@
           <w:sz w:val="24"/>
           <w:szCs w:val="24"/>
         </w:rPr>
-        <w:t xml:space="preserve">O controle de equipamentos e insumos de Tecnologia da Informação (TI) em ambientes hospitalares costuma ser feito de forma informal, o que favorece a falta de itens críticos, como periféricos e suprimentos de impressão, no momento em que os setores assistenciais e administrativos precisam deles. Este trabalho apresenta o desenvolvimento de um sistema desktop de controle de estoque de TI, implementado em Python com interface gráfica Tkinter, que contempla cadastro de itens, registro de entradas e saídas por setor, alerta de estoque mínimo e relatórios. O sistema aplica registros, vetores, matrizes, pesquisa sequencial e binária, ordenação por inserção e funções recursivas. A qualidade foi avaliada segundo as características de eficiência de desempenho e de usabilidade da norma ISO/IEC 25010, por meio de medição de tempos com estoques de 100 a 20.000 itens, teste de carga com 50 usuários simulados executando 10.000 operações, teste automatizado ponta a ponta, avaliação heurística e estimativa de tempo de tarefas pelo modelo Keystroke-Level Model. As medições revelaram dois defeitos, um gargalo na ordenação e um estouro de recursão no relatório, ambos corrigidos. Após as correções, todas as operações do teste de carga responderam em até 100 ms, sem nenhuma inconsistência nos dados. Conclui-se que o sistema atende ao objetivo para o porte de um estoque de TI hospitalar, com limitações de escalabilidade decorrentes do armazenamento em arquivo JSON.</w:t>
+        <w:t xml:space="preserve">O controle de equipamentos e insumos de Tecnologia da Informação (TI) em ambientes hospitalares costuma ser feito de forma informal, o que favorece a falta de itens críticos, como periféricos e suprimentos de impressão, no momento em que os setores assistenciais e administrativos precisam deles. Este trabalho apresenta o desenvolvimento de um sistema desktop de controle de estoque de TI, implementado em Python com interface gráfica Tkinter, que contempla cadastro de itens, registro de entradas e saídas por setor, alerta de estoque mínimo e relatórios. O sistema aplica registros, vetores, matrizes, pesquisa sequencial e binária, ordenação por inserção e funções recursivas. A qualidade foi avaliada segundo as características de eficiência de desempenho e de usabilidade da norma ISO/IEC 25010, por meio de medição de tempos com estoques de 100 a 20.000 itens, teste de carga com 50 usuários simulados executando 10.000 operações, teste automatizado ponta a ponta, avaliação heurística, percurso cognitivo com personas e estimativa de tempo de tarefas pelo modelo Keystroke-Level Model. As medições revelaram dois defeitos, um gargalo na ordenação e um estouro de recursão no relatório, ambos corrigidos. Após as correções, todas as operações do teste de carga responderam em até 100 ms, sem nenhuma inconsistência nos dados. Conclui-se que o sistema atende ao objetivo para o porte de um estoque de TI hospitalar, com limitações de escalabilidade decorrentes do armazenamento em arquivo JSON.</w:t>
       </w:r>
     </w:p>
     <w:p>
@@ -306,7 +306,7 @@
           <w:sz w:val="24"/>
           <w:szCs w:val="24"/>
         </w:rPr>
-        <w:t xml:space="preserve">Inventory control of Information Technology (IT) equipment and supplies in hospital settings is often handled informally, which leads to shortages of critical items, such as peripherals and printing supplies, when clinical and administrative departments need them. This work presents the development of a desktop IT inventory control system, implemented in Python with a Tkinter graphical interface, covering item registration, stock entries and withdrawals by department, minimum stock alerts and reports. The system applies records, arrays, matrices, sequential and binary search, insertion sort and recursive functions. Quality was assessed according to the performance efficiency and usability characteristics of the ISO/IEC 25010 standard, through time measurements with inventories of 100 to 20,000 items, a load test with 50 simulated users performing 10,000 operations, an automated end-to-end test, heuristic evaluation and task time estimation with the Keystroke-Level Model. The measurements revealed two defects, a sorting bottleneck and a recursion overflow in the report, both of which were fixed. After the fixes, every operation in the load test responded within 100 ms, with no data inconsistency. It is concluded that the system meets its objective for the size of a hospital IT inventory, with scalability limitations arising from JSON file storage.</w:t>
+        <w:t xml:space="preserve">Inventory control of Information Technology (IT) equipment and supplies in hospital settings is often handled informally, which leads to shortages of critical items, such as peripherals and printing supplies, when clinical and administrative departments need them. This work presents the development of a desktop IT inventory control system, implemented in Python with a Tkinter graphical interface, covering item registration, stock entries and withdrawals by department, minimum stock alerts and reports. The system applies records, arrays, matrices, sequential and binary search, insertion sort and recursive functions. Quality was assessed according to the performance efficiency and usability characteristics of the ISO/IEC 25010 standard, through time measurements with inventories of 100 to 20,000 items, a load test with 50 simulated users performing 10,000 operations, an automated end-to-end test, heuristic evaluation, a cognitive walkthrough with personas and task time estimation with the Keystroke-Level Model. The measurements revealed two defects, a sorting bottleneck and a recursion overflow in the report, both of which were fixed. After the fixes, every operation in the load test responded within 100 ms, with no data inconsistency. It is concluded that the system meets its objective for the size of a hospital IT inventory, with scalability limitations arising from JSON file storage.</w:t>
       </w:r>
     </w:p>
     <w:p>
@@ -1007,12 +1007,12 @@
       <w:r>
         <w:rPr>
           <w:rFonts w:ascii="Arial" w:cs="Arial" w:eastAsia="Arial" w:hAnsi="Arial"/>
-          <w:b/>
-          <w:bCs/>
-          <w:sz w:val="24"/>
-          <w:szCs w:val="24"/>
-        </w:rPr>
-        <w:t xml:space="preserve">7 CONCLUSÃO</w:t>
+          <w:b w:val="false"/>
+          <w:bCs w:val="false"/>
+          <w:sz w:val="24"/>
+          <w:szCs w:val="24"/>
+        </w:rPr>
+        <w:t xml:space="preserve">6.5 Percurso cognitivo com personas (relatos simulados)</w:t>
       </w:r>
       <w:r>
         <w:rPr>
@@ -1025,12 +1025,12 @@
       <w:r>
         <w:rPr>
           <w:rFonts w:ascii="Arial" w:cs="Arial" w:eastAsia="Arial" w:hAnsi="Arial"/>
-          <w:b/>
-          <w:bCs/>
-          <w:sz w:val="24"/>
-          <w:szCs w:val="24"/>
-        </w:rPr>
-        <w:t xml:space="preserve">21</w:t>
+          <w:b w:val="false"/>
+          <w:bCs w:val="false"/>
+          <w:sz w:val="24"/>
+          <w:szCs w:val="24"/>
+        </w:rPr>
+        <w:t xml:space="preserve">20</w:t>
       </w:r>
     </w:p>
     <w:p>
@@ -1048,7 +1048,7 @@
           <w:sz w:val="24"/>
           <w:szCs w:val="24"/>
         </w:rPr>
-        <w:t xml:space="preserve">REFERÊNCIAS</w:t>
+        <w:t xml:space="preserve">7 CONCLUSÃO</w:t>
       </w:r>
       <w:r>
         <w:rPr>
@@ -1066,7 +1066,7 @@
           <w:sz w:val="24"/>
           <w:szCs w:val="24"/>
         </w:rPr>
-        <w:t xml:space="preserve">22</w:t>
+        <w:t xml:space="preserve">23</w:t>
       </w:r>
     </w:p>
     <w:p>
@@ -1084,7 +1084,7 @@
           <w:sz w:val="24"/>
           <w:szCs w:val="24"/>
         </w:rPr>
-        <w:t xml:space="preserve">ANEXO A – CÓDIGO-FONTE DO NÚCLEO DO SISTEMA (ESTOQUE.PY)</w:t>
+        <w:t xml:space="preserve">REFERÊNCIAS</w:t>
       </w:r>
       <w:r>
         <w:rPr>
@@ -1102,7 +1102,43 @@
           <w:sz w:val="24"/>
           <w:szCs w:val="24"/>
         </w:rPr>
-        <w:t xml:space="preserve">23</w:t>
+        <w:t xml:space="preserve">24</w:t>
+      </w:r>
+    </w:p>
+    <w:p>
+      <w:pPr>
+        <w:tabs>
+          <w:tab w:val="right" w:pos="9070" w:leader="dot"/>
+        </w:tabs>
+        <w:spacing w:after="0" w:line="360"/>
+      </w:pPr>
+      <w:r>
+        <w:rPr>
+          <w:rFonts w:ascii="Arial" w:cs="Arial" w:eastAsia="Arial" w:hAnsi="Arial"/>
+          <w:b/>
+          <w:bCs/>
+          <w:sz w:val="24"/>
+          <w:szCs w:val="24"/>
+        </w:rPr>
+        <w:t xml:space="preserve">ANEXO A – CÓDIGO-FONTE DO NÚCLEO DO SISTEMA (ESTOQUE.PY)</w:t>
+      </w:r>
+      <w:r>
+        <w:rPr>
+          <w:rFonts w:ascii="Arial" w:cs="Arial" w:eastAsia="Arial" w:hAnsi="Arial"/>
+          <w:sz w:val="24"/>
+          <w:szCs w:val="24"/>
+        </w:rPr>
+        <w:tab/>
+      </w:r>
+      <w:r>
+        <w:rPr>
+          <w:rFonts w:ascii="Arial" w:cs="Arial" w:eastAsia="Arial" w:hAnsi="Arial"/>
+          <w:b/>
+          <w:bCs/>
+          <w:sz w:val="24"/>
+          <w:szCs w:val="24"/>
+        </w:rPr>
+        <w:t xml:space="preserve">25</w:t>
       </w:r>
     </w:p>
     <w:p>
@@ -3157,6 +3193,57 @@
           <w:sz w:val="24"/>
           <w:szCs w:val="24"/>
         </w:rPr>
+        <w:t xml:space="preserve">Por fim, para antecipar como diferentes perfis de funcionários do hospital interagiriam com o sistema, foi aplicado o percurso cognitivo (WHARTON </w:t>
+      </w:r>
+      <w:r>
+        <w:rPr>
+          <w:rFonts w:ascii="Arial" w:cs="Arial" w:eastAsia="Arial" w:hAnsi="Arial"/>
+          <w:i/>
+          <w:iCs/>
+          <w:sz w:val="24"/>
+          <w:szCs w:val="24"/>
+        </w:rPr>
+        <w:t xml:space="preserve">et al</w:t>
+      </w:r>
+      <w:r>
+        <w:rPr>
+          <w:rFonts w:ascii="Arial" w:cs="Arial" w:eastAsia="Arial" w:hAnsi="Arial"/>
+          <w:sz w:val="24"/>
+          <w:szCs w:val="24"/>
+        </w:rPr>
+        <w:t xml:space="preserve">., 1994) com base em personas, isto é, usuários fictícios construídos a partir dos perfis reais que utilizariam o sistema (COOPER, 1999). Em cada passo das tarefas, avaliou-se se o usuário saberia o que fazer, se encontraria o comando correto e se compreenderia a resposta do sistema. Os relatos resultantes são </w:t>
+      </w:r>
+      <w:r>
+        <w:rPr>
+          <w:rFonts w:ascii="Arial" w:cs="Arial" w:eastAsia="Arial" w:hAnsi="Arial"/>
+          <w:b/>
+          <w:bCs/>
+          <w:sz w:val="24"/>
+          <w:szCs w:val="24"/>
+        </w:rPr>
+        <w:t xml:space="preserve">simulados</w:t>
+      </w:r>
+      <w:r>
+        <w:rPr>
+          <w:rFonts w:ascii="Arial" w:cs="Arial" w:eastAsia="Arial" w:hAnsi="Arial"/>
+          <w:sz w:val="24"/>
+          <w:szCs w:val="24"/>
+        </w:rPr>
+        <w:t xml:space="preserve">: foram elaborados pelo autor a partir do funcionamento do sistema e não foram coletados com participantes reais.</w:t>
+      </w:r>
+    </w:p>
+    <w:p>
+      <w:pPr>
+        <w:spacing w:after="200" w:line="360"/>
+        <w:ind w:firstLine="709"/>
+        <w:jc w:val="both"/>
+      </w:pPr>
+      <w:r>
+        <w:rPr>
+          <w:rFonts w:ascii="Arial" w:cs="Arial" w:eastAsia="Arial" w:hAnsi="Arial"/>
+          <w:sz w:val="24"/>
+          <w:szCs w:val="24"/>
+        </w:rPr>
         <w:t xml:space="preserve">Complementarmente, a interface registra em arquivo o tempo gasto e os erros de validação de cada formulário, e foi preparado um roteiro de teste com usuários acompanhado do questionário SUS (BROOKE, 1996), para aplicação com a equipe do hospital.</w:t>
       </w:r>
     </w:p>
@@ -9751,7 +9838,7 @@
                 <w:sz w:val="20"/>
                 <w:szCs w:val="20"/>
               </w:rPr>
-              <w:t xml:space="preserve">11</w:t>
+              <w:t xml:space="preserve">10</w:t>
             </w:r>
           </w:p>
         </w:tc>
@@ -9853,7 +9940,7 @@
                 <w:sz w:val="20"/>
                 <w:szCs w:val="20"/>
               </w:rPr>
-              <w:t xml:space="preserve">9,0</w:t>
+              <w:t xml:space="preserve">8,8</w:t>
             </w:r>
           </w:p>
         </w:tc>
@@ -10101,7 +10188,7 @@
                 <w:sz w:val="20"/>
                 <w:szCs w:val="20"/>
               </w:rPr>
-              <w:t xml:space="preserve">3</w:t>
+              <w:t xml:space="preserve">2</w:t>
             </w:r>
           </w:p>
         </w:tc>
@@ -10203,7 +10290,7 @@
                 <w:sz w:val="20"/>
                 <w:szCs w:val="20"/>
               </w:rPr>
-              <w:t xml:space="preserve">6,5</w:t>
+              <w:t xml:space="preserve">6,3</w:t>
             </w:r>
           </w:p>
         </w:tc>
@@ -10492,6 +10579,1510 @@
     </w:p>
     <w:p>
       <w:pPr>
+        <w:pStyle w:val="Heading2"/>
+        <w:keepNext/>
+        <w:spacing w:after="360" w:before="360" w:line="360"/>
+      </w:pPr>
+      <w:r>
+        <w:rPr>
+          <w:rFonts w:ascii="Arial" w:cs="Arial" w:eastAsia="Arial" w:hAnsi="Arial"/>
+          <w:b/>
+          <w:bCs/>
+          <w:sz w:val="24"/>
+          <w:szCs w:val="24"/>
+        </w:rPr>
+        <w:t xml:space="preserve">6.5 Percurso cognitivo com personas (relatos simulados)</w:t>
+      </w:r>
+    </w:p>
+    <w:p>
+      <w:pPr>
+        <w:spacing w:after="200" w:line="360"/>
+        <w:ind w:firstLine="709"/>
+        <w:jc w:val="both"/>
+      </w:pPr>
+      <w:r>
+        <w:rPr>
+          <w:rFonts w:ascii="Arial" w:cs="Arial" w:eastAsia="Arial" w:hAnsi="Arial"/>
+          <w:sz w:val="24"/>
+          <w:szCs w:val="24"/>
+        </w:rPr>
+        <w:t xml:space="preserve">Foram definidas três personas, apresentadas no Quadro 3, representando os perfis que usariam o sistema no hospital-dia. Os relatos a seguir descrevem, de forma simulada, a execução das tarefas por cada persona, destacando as dificuldades que o percurso cognitivo permitiu antecipar.</w:t>
+      </w:r>
+    </w:p>
+    <w:p>
+      <w:pPr>
+        <w:keepNext/>
+        <w:spacing w:after="80" w:before="240"/>
+        <w:jc w:val="center"/>
+      </w:pPr>
+      <w:r>
+        <w:rPr>
+          <w:rFonts w:ascii="Arial" w:cs="Arial" w:eastAsia="Arial" w:hAnsi="Arial"/>
+          <w:b/>
+          <w:bCs/>
+          <w:sz w:val="20"/>
+          <w:szCs w:val="20"/>
+        </w:rPr>
+        <w:t xml:space="preserve">Quadro 3 – Personas utilizadas no percurso cognitivo</w:t>
+      </w:r>
+    </w:p>
+    <w:tbl>
+      <w:tblPr>
+        <w:tblW w:type="dxa" w:w="9072"/>
+        <w:jc w:val="center"/>
+        <w:tblBorders>
+          <w:top w:val="single" w:color="auto" w:sz="4"/>
+          <w:left w:val="single" w:color="auto" w:sz="4"/>
+          <w:bottom w:val="single" w:color="auto" w:sz="4"/>
+          <w:right w:val="single" w:color="auto" w:sz="4"/>
+          <w:insideH w:val="single" w:color="auto" w:sz="4"/>
+          <w:insideV w:val="single" w:color="auto" w:sz="4"/>
+        </w:tblBorders>
+      </w:tblPr>
+      <w:tblGrid>
+        <w:gridCol w:w="1814"/>
+        <w:gridCol w:w="5557"/>
+        <w:gridCol w:w="1701"/>
+      </w:tblGrid>
+      <w:tr>
+        <w:trPr>
+          <w:tblHeader/>
+        </w:trPr>
+        <w:tc>
+          <w:tcPr>
+            <w:tcW w:type="dxa" w:w="1814"/>
+            <w:tcBorders>
+              <w:top w:val="single" w:color="000000" w:sz="6"/>
+              <w:left w:val="single" w:color="000000" w:sz="6"/>
+              <w:bottom w:val="single" w:color="000000" w:sz="6"/>
+              <w:right w:val="single" w:color="000000" w:sz="6"/>
+            </w:tcBorders>
+            <w:shd w:fill="E8EEF5" w:color="auto" w:val="clear"/>
+            <w:tcMar>
+              <w:top w:type="dxa" w:w="50"/>
+              <w:left w:type="dxa" w:w="80"/>
+              <w:bottom w:type="dxa" w:w="50"/>
+              <w:right w:type="dxa" w:w="80"/>
+            </w:tcMar>
+            <w:vAlign w:val="center"/>
+          </w:tcPr>
+          <w:p>
+            <w:pPr>
+              <w:keepNext/>
+              <w:jc w:val="left"/>
+            </w:pPr>
+            <w:r>
+              <w:rPr>
+                <w:rFonts w:ascii="Arial" w:cs="Arial" w:eastAsia="Arial" w:hAnsi="Arial"/>
+                <w:b/>
+                <w:bCs/>
+                <w:sz w:val="20"/>
+                <w:szCs w:val="20"/>
+              </w:rPr>
+              <w:t xml:space="preserve">Persona</w:t>
+            </w:r>
+          </w:p>
+        </w:tc>
+        <w:tc>
+          <w:tcPr>
+            <w:tcW w:type="dxa" w:w="5557"/>
+            <w:tcBorders>
+              <w:top w:val="single" w:color="000000" w:sz="6"/>
+              <w:left w:val="single" w:color="000000" w:sz="6"/>
+              <w:bottom w:val="single" w:color="000000" w:sz="6"/>
+              <w:right w:val="single" w:color="000000" w:sz="6"/>
+            </w:tcBorders>
+            <w:shd w:fill="E8EEF5" w:color="auto" w:val="clear"/>
+            <w:tcMar>
+              <w:top w:type="dxa" w:w="50"/>
+              <w:left w:type="dxa" w:w="80"/>
+              <w:bottom w:type="dxa" w:w="50"/>
+              <w:right w:type="dxa" w:w="80"/>
+            </w:tcMar>
+            <w:vAlign w:val="center"/>
+          </w:tcPr>
+          <w:p>
+            <w:pPr>
+              <w:keepNext/>
+              <w:jc w:val="center"/>
+            </w:pPr>
+            <w:r>
+              <w:rPr>
+                <w:rFonts w:ascii="Arial" w:cs="Arial" w:eastAsia="Arial" w:hAnsi="Arial"/>
+                <w:b/>
+                <w:bCs/>
+                <w:sz w:val="20"/>
+                <w:szCs w:val="20"/>
+              </w:rPr>
+              <w:t xml:space="preserve">Perfil</w:t>
+            </w:r>
+          </w:p>
+        </w:tc>
+        <w:tc>
+          <w:tcPr>
+            <w:tcW w:type="dxa" w:w="1701"/>
+            <w:tcBorders>
+              <w:top w:val="single" w:color="000000" w:sz="6"/>
+              <w:left w:val="single" w:color="000000" w:sz="6"/>
+              <w:bottom w:val="single" w:color="000000" w:sz="6"/>
+              <w:right w:val="single" w:color="000000" w:sz="6"/>
+            </w:tcBorders>
+            <w:shd w:fill="E8EEF5" w:color="auto" w:val="clear"/>
+            <w:tcMar>
+              <w:top w:type="dxa" w:w="50"/>
+              <w:left w:type="dxa" w:w="80"/>
+              <w:bottom w:type="dxa" w:w="50"/>
+              <w:right w:type="dxa" w:w="80"/>
+            </w:tcMar>
+            <w:vAlign w:val="center"/>
+          </w:tcPr>
+          <w:p>
+            <w:pPr>
+              <w:keepNext/>
+              <w:jc w:val="center"/>
+            </w:pPr>
+            <w:r>
+              <w:rPr>
+                <w:rFonts w:ascii="Arial" w:cs="Arial" w:eastAsia="Arial" w:hAnsi="Arial"/>
+                <w:b/>
+                <w:bCs/>
+                <w:sz w:val="20"/>
+                <w:szCs w:val="20"/>
+              </w:rPr>
+              <w:t xml:space="preserve">Tarefas avaliadas</w:t>
+            </w:r>
+          </w:p>
+        </w:tc>
+      </w:tr>
+      <w:tr>
+        <w:trPr>
+          <w:cantSplit/>
+        </w:trPr>
+        <w:tc>
+          <w:tcPr>
+            <w:tcW w:type="dxa" w:w="1814"/>
+            <w:tcBorders>
+              <w:top w:val="single" w:color="000000" w:sz="6"/>
+              <w:left w:val="single" w:color="000000" w:sz="6"/>
+              <w:bottom w:val="single" w:color="000000" w:sz="6"/>
+              <w:right w:val="single" w:color="000000" w:sz="6"/>
+            </w:tcBorders>
+            <w:tcMar>
+              <w:top w:type="dxa" w:w="50"/>
+              <w:left w:type="dxa" w:w="80"/>
+              <w:bottom w:type="dxa" w:w="50"/>
+              <w:right w:type="dxa" w:w="80"/>
+            </w:tcMar>
+            <w:vAlign w:val="center"/>
+          </w:tcPr>
+          <w:p>
+            <w:pPr>
+              <w:keepNext/>
+              <w:jc w:val="left"/>
+            </w:pPr>
+            <w:r>
+              <w:rPr>
+                <w:rFonts w:ascii="Arial" w:cs="Arial" w:eastAsia="Arial" w:hAnsi="Arial"/>
+                <w:b w:val="false"/>
+                <w:bCs w:val="false"/>
+                <w:sz w:val="20"/>
+                <w:szCs w:val="20"/>
+              </w:rPr>
+              <w:t xml:space="preserve">Carla, 34 anos</w:t>
+            </w:r>
+          </w:p>
+        </w:tc>
+        <w:tc>
+          <w:tcPr>
+            <w:tcW w:type="dxa" w:w="5557"/>
+            <w:tcBorders>
+              <w:top w:val="single" w:color="000000" w:sz="6"/>
+              <w:left w:val="single" w:color="000000" w:sz="6"/>
+              <w:bottom w:val="single" w:color="000000" w:sz="6"/>
+              <w:right w:val="single" w:color="000000" w:sz="6"/>
+            </w:tcBorders>
+            <w:tcMar>
+              <w:top w:type="dxa" w:w="50"/>
+              <w:left w:type="dxa" w:w="80"/>
+              <w:bottom w:type="dxa" w:w="50"/>
+              <w:right w:type="dxa" w:w="80"/>
+            </w:tcMar>
+            <w:vAlign w:val="center"/>
+          </w:tcPr>
+          <w:p>
+            <w:pPr>
+              <w:keepNext/>
+              <w:jc w:val="left"/>
+            </w:pPr>
+            <w:r>
+              <w:rPr>
+                <w:rFonts w:ascii="Arial" w:cs="Arial" w:eastAsia="Arial" w:hAnsi="Arial"/>
+                <w:b w:val="false"/>
+                <w:bCs w:val="false"/>
+                <w:sz w:val="20"/>
+                <w:szCs w:val="20"/>
+              </w:rPr>
+              <w:t xml:space="preserve">Técnica de TI; usa o sistema todos os dias e tem muita familiaridade com computadores e atalhos de teclado</w:t>
+            </w:r>
+          </w:p>
+        </w:tc>
+        <w:tc>
+          <w:tcPr>
+            <w:tcW w:type="dxa" w:w="1701"/>
+            <w:tcBorders>
+              <w:top w:val="single" w:color="000000" w:sz="6"/>
+              <w:left w:val="single" w:color="000000" w:sz="6"/>
+              <w:bottom w:val="single" w:color="000000" w:sz="6"/>
+              <w:right w:val="single" w:color="000000" w:sz="6"/>
+            </w:tcBorders>
+            <w:tcMar>
+              <w:top w:type="dxa" w:w="50"/>
+              <w:left w:type="dxa" w:w="80"/>
+              <w:bottom w:type="dxa" w:w="50"/>
+              <w:right w:type="dxa" w:w="80"/>
+            </w:tcMar>
+            <w:vAlign w:val="center"/>
+          </w:tcPr>
+          <w:p>
+            <w:pPr>
+              <w:keepNext/>
+              <w:jc w:val="left"/>
+            </w:pPr>
+            <w:r>
+              <w:rPr>
+                <w:rFonts w:ascii="Arial" w:cs="Arial" w:eastAsia="Arial" w:hAnsi="Arial"/>
+                <w:b w:val="false"/>
+                <w:bCs w:val="false"/>
+                <w:sz w:val="20"/>
+                <w:szCs w:val="20"/>
+              </w:rPr>
+              <w:t xml:space="preserve">T1, T2, T4</w:t>
+            </w:r>
+          </w:p>
+        </w:tc>
+      </w:tr>
+      <w:tr>
+        <w:trPr>
+          <w:cantSplit/>
+        </w:trPr>
+        <w:tc>
+          <w:tcPr>
+            <w:tcW w:type="dxa" w:w="1814"/>
+            <w:tcBorders>
+              <w:top w:val="single" w:color="000000" w:sz="6"/>
+              <w:left w:val="single" w:color="000000" w:sz="6"/>
+              <w:bottom w:val="single" w:color="000000" w:sz="6"/>
+              <w:right w:val="single" w:color="000000" w:sz="6"/>
+            </w:tcBorders>
+            <w:tcMar>
+              <w:top w:type="dxa" w:w="50"/>
+              <w:left w:type="dxa" w:w="80"/>
+              <w:bottom w:type="dxa" w:w="50"/>
+              <w:right w:type="dxa" w:w="80"/>
+            </w:tcMar>
+            <w:vAlign w:val="center"/>
+          </w:tcPr>
+          <w:p>
+            <w:pPr>
+              <w:keepNext/>
+              <w:jc w:val="left"/>
+            </w:pPr>
+            <w:r>
+              <w:rPr>
+                <w:rFonts w:ascii="Arial" w:cs="Arial" w:eastAsia="Arial" w:hAnsi="Arial"/>
+                <w:b w:val="false"/>
+                <w:bCs w:val="false"/>
+                <w:sz w:val="20"/>
+                <w:szCs w:val="20"/>
+              </w:rPr>
+              <w:t xml:space="preserve">Jorge, 52 anos</w:t>
+            </w:r>
+          </w:p>
+        </w:tc>
+        <w:tc>
+          <w:tcPr>
+            <w:tcW w:type="dxa" w:w="5557"/>
+            <w:tcBorders>
+              <w:top w:val="single" w:color="000000" w:sz="6"/>
+              <w:left w:val="single" w:color="000000" w:sz="6"/>
+              <w:bottom w:val="single" w:color="000000" w:sz="6"/>
+              <w:right w:val="single" w:color="000000" w:sz="6"/>
+            </w:tcBorders>
+            <w:tcMar>
+              <w:top w:type="dxa" w:w="50"/>
+              <w:left w:type="dxa" w:w="80"/>
+              <w:bottom w:type="dxa" w:w="50"/>
+              <w:right w:type="dxa" w:w="80"/>
+            </w:tcMar>
+            <w:vAlign w:val="center"/>
+          </w:tcPr>
+          <w:p>
+            <w:pPr>
+              <w:keepNext/>
+              <w:jc w:val="left"/>
+            </w:pPr>
+            <w:r>
+              <w:rPr>
+                <w:rFonts w:ascii="Arial" w:cs="Arial" w:eastAsia="Arial" w:hAnsi="Arial"/>
+                <w:b w:val="false"/>
+                <w:bCs w:val="false"/>
+                <w:sz w:val="20"/>
+                <w:szCs w:val="20"/>
+              </w:rPr>
+              <w:t xml:space="preserve">Auxiliar de almoxarifado; pouca familiaridade com computadores, digita devagar e prefere usar o mouse</w:t>
+            </w:r>
+          </w:p>
+        </w:tc>
+        <w:tc>
+          <w:tcPr>
+            <w:tcW w:type="dxa" w:w="1701"/>
+            <w:tcBorders>
+              <w:top w:val="single" w:color="000000" w:sz="6"/>
+              <w:left w:val="single" w:color="000000" w:sz="6"/>
+              <w:bottom w:val="single" w:color="000000" w:sz="6"/>
+              <w:right w:val="single" w:color="000000" w:sz="6"/>
+            </w:tcBorders>
+            <w:tcMar>
+              <w:top w:type="dxa" w:w="50"/>
+              <w:left w:type="dxa" w:w="80"/>
+              <w:bottom w:type="dxa" w:w="50"/>
+              <w:right w:type="dxa" w:w="80"/>
+            </w:tcMar>
+            <w:vAlign w:val="center"/>
+          </w:tcPr>
+          <w:p>
+            <w:pPr>
+              <w:keepNext/>
+              <w:jc w:val="left"/>
+            </w:pPr>
+            <w:r>
+              <w:rPr>
+                <w:rFonts w:ascii="Arial" w:cs="Arial" w:eastAsia="Arial" w:hAnsi="Arial"/>
+                <w:b w:val="false"/>
+                <w:bCs w:val="false"/>
+                <w:sz w:val="20"/>
+                <w:szCs w:val="20"/>
+              </w:rPr>
+              <w:t xml:space="preserve">T2, T3, T4</w:t>
+            </w:r>
+          </w:p>
+        </w:tc>
+      </w:tr>
+      <w:tr>
+        <w:trPr>
+          <w:cantSplit/>
+        </w:trPr>
+        <w:tc>
+          <w:tcPr>
+            <w:tcW w:type="dxa" w:w="1814"/>
+            <w:tcBorders>
+              <w:top w:val="single" w:color="000000" w:sz="6"/>
+              <w:left w:val="single" w:color="000000" w:sz="6"/>
+              <w:bottom w:val="single" w:color="000000" w:sz="6"/>
+              <w:right w:val="single" w:color="000000" w:sz="6"/>
+            </w:tcBorders>
+            <w:tcMar>
+              <w:top w:type="dxa" w:w="50"/>
+              <w:left w:type="dxa" w:w="80"/>
+              <w:bottom w:type="dxa" w:w="50"/>
+              <w:right w:type="dxa" w:w="80"/>
+            </w:tcMar>
+            <w:vAlign w:val="center"/>
+          </w:tcPr>
+          <w:p>
+            <w:pPr>
+              <w:keepNext w:val="false"/>
+              <w:jc w:val="left"/>
+            </w:pPr>
+            <w:r>
+              <w:rPr>
+                <w:rFonts w:ascii="Arial" w:cs="Arial" w:eastAsia="Arial" w:hAnsi="Arial"/>
+                <w:b w:val="false"/>
+                <w:bCs w:val="false"/>
+                <w:sz w:val="20"/>
+                <w:szCs w:val="20"/>
+              </w:rPr>
+              <w:t xml:space="preserve">Fernanda, 27 anos</w:t>
+            </w:r>
+          </w:p>
+        </w:tc>
+        <w:tc>
+          <w:tcPr>
+            <w:tcW w:type="dxa" w:w="5557"/>
+            <w:tcBorders>
+              <w:top w:val="single" w:color="000000" w:sz="6"/>
+              <w:left w:val="single" w:color="000000" w:sz="6"/>
+              <w:bottom w:val="single" w:color="000000" w:sz="6"/>
+              <w:right w:val="single" w:color="000000" w:sz="6"/>
+            </w:tcBorders>
+            <w:tcMar>
+              <w:top w:type="dxa" w:w="50"/>
+              <w:left w:type="dxa" w:w="80"/>
+              <w:bottom w:type="dxa" w:w="50"/>
+              <w:right w:type="dxa" w:w="80"/>
+            </w:tcMar>
+            <w:vAlign w:val="center"/>
+          </w:tcPr>
+          <w:p>
+            <w:pPr>
+              <w:keepNext w:val="false"/>
+              <w:jc w:val="left"/>
+            </w:pPr>
+            <w:r>
+              <w:rPr>
+                <w:rFonts w:ascii="Arial" w:cs="Arial" w:eastAsia="Arial" w:hAnsi="Arial"/>
+                <w:b w:val="false"/>
+                <w:bCs w:val="false"/>
+                <w:sz w:val="20"/>
+                <w:szCs w:val="20"/>
+              </w:rPr>
+              <w:t xml:space="preserve">Analista administrativa; consulta o estoque para planejar compras, sem registrar movimentações</w:t>
+            </w:r>
+          </w:p>
+        </w:tc>
+        <w:tc>
+          <w:tcPr>
+            <w:tcW w:type="dxa" w:w="1701"/>
+            <w:tcBorders>
+              <w:top w:val="single" w:color="000000" w:sz="6"/>
+              <w:left w:val="single" w:color="000000" w:sz="6"/>
+              <w:bottom w:val="single" w:color="000000" w:sz="6"/>
+              <w:right w:val="single" w:color="000000" w:sz="6"/>
+            </w:tcBorders>
+            <w:tcMar>
+              <w:top w:type="dxa" w:w="50"/>
+              <w:left w:type="dxa" w:w="80"/>
+              <w:bottom w:type="dxa" w:w="50"/>
+              <w:right w:type="dxa" w:w="80"/>
+            </w:tcMar>
+            <w:vAlign w:val="center"/>
+          </w:tcPr>
+          <w:p>
+            <w:pPr>
+              <w:keepNext w:val="false"/>
+              <w:jc w:val="left"/>
+            </w:pPr>
+            <w:r>
+              <w:rPr>
+                <w:rFonts w:ascii="Arial" w:cs="Arial" w:eastAsia="Arial" w:hAnsi="Arial"/>
+                <w:b w:val="false"/>
+                <w:bCs w:val="false"/>
+                <w:sz w:val="20"/>
+                <w:szCs w:val="20"/>
+              </w:rPr>
+              <w:t xml:space="preserve">T3, T5</w:t>
+            </w:r>
+          </w:p>
+        </w:tc>
+      </w:tr>
+    </w:tbl>
+    <w:p>
+      <w:pPr>
+        <w:spacing w:after="280" w:before="60"/>
+        <w:jc w:val="center"/>
+      </w:pPr>
+      <w:r>
+        <w:rPr>
+          <w:rFonts w:ascii="Arial" w:cs="Arial" w:eastAsia="Arial" w:hAnsi="Arial"/>
+          <w:sz w:val="20"/>
+          <w:szCs w:val="20"/>
+        </w:rPr>
+        <w:t xml:space="preserve">Fonte: Autor, 2026. Personas fictícias, elaboradas a partir dos perfis reais de usuários.</w:t>
+      </w:r>
+    </w:p>
+    <w:p>
+      <w:pPr>
+        <w:spacing w:after="200" w:line="360"/>
+        <w:ind w:firstLine="709"/>
+        <w:jc w:val="both"/>
+      </w:pPr>
+      <w:r>
+        <w:rPr>
+          <w:rFonts w:ascii="Arial" w:cs="Arial" w:eastAsia="Arial" w:hAnsi="Arial"/>
+          <w:b/>
+          <w:bCs/>
+          <w:sz w:val="24"/>
+          <w:szCs w:val="24"/>
+        </w:rPr>
+        <w:t xml:space="preserve">Relato simulado de Carla.</w:t>
+      </w:r>
+      <w:r>
+        <w:rPr>
+          <w:rFonts w:ascii="Arial" w:cs="Arial" w:eastAsia="Arial" w:hAnsi="Arial"/>
+          <w:sz w:val="24"/>
+          <w:szCs w:val="24"/>
+        </w:rPr>
+        <w:t xml:space="preserve"> Por já conhecer o sistema, Carla cadastraria o headset e registraria a entrada dos toners rapidamente, usando a tecla Tab entre os campos e Enter para confirmar. Para a saída dos mouses, o duplo clique na linha da tabela a levaria direto ao formulário com o item escolhido. O percurso, no entanto, revelou duas situações de dificuldade. Primeiro, ao perceber que registrou uma saída com a quantidade errada, Carla não encontraria uma opção para desfazer ou estornar o lançamento e teria de registrar uma entrada para compensar, deixando duas movimentações no histórico do setor. Segundo, acostumada a pressionar Ctrl+S para salvar em outros programas, ela abriria sem querer o formulário de saída.</w:t>
+      </w:r>
+    </w:p>
+    <w:p>
+      <w:pPr>
+        <w:spacing w:after="200" w:line="360"/>
+        <w:ind w:firstLine="709"/>
+        <w:jc w:val="both"/>
+      </w:pPr>
+      <w:r>
+        <w:rPr>
+          <w:rFonts w:ascii="Arial" w:cs="Arial" w:eastAsia="Arial" w:hAnsi="Arial"/>
+          <w:b/>
+          <w:bCs/>
+          <w:sz w:val="24"/>
+          <w:szCs w:val="24"/>
+        </w:rPr>
+        <w:t xml:space="preserve">Relato simulado de Jorge.</w:t>
+      </w:r>
+      <w:r>
+        <w:rPr>
+          <w:rFonts w:ascii="Arial" w:cs="Arial" w:eastAsia="Arial" w:hAnsi="Arial"/>
+          <w:sz w:val="24"/>
+          <w:szCs w:val="24"/>
+        </w:rPr>
+        <w:t xml:space="preserve"> Jorge usaria o mouse e os botões rotulados, sem recorrer a atalhos. Na saída dos mouses, ele clicaria no item e em seguida no botão de saída. No formulário, o campo de quantidade já vinha preenchido com o valor 1; ao digitar 2 sem apagar o valor anterior, Jorge poderia registrar 12 ou 21 unidades sem perceber, porque o número resultante continua válido e, havendo saldo, a saída seria aceita. Esse foi o problema mais grave identificado no percurso, pois produz um erro silencioso no estoque. Ao tentar uma saída maior que o saldo, por outro lado, a mensagem que informa a quantidade disponível seria suficiente para que ele corrigisse o valor sozinho. Os símbolos de seta nos botões de entrada e saída poderiam gerar uma breve hesitação, compensada pelos rótulos escritos.</w:t>
+      </w:r>
+    </w:p>
+    <w:p>
+      <w:pPr>
+        <w:spacing w:after="200" w:line="360"/>
+        <w:ind w:firstLine="709"/>
+        <w:jc w:val="both"/>
+      </w:pPr>
+      <w:r>
+        <w:rPr>
+          <w:rFonts w:ascii="Arial" w:cs="Arial" w:eastAsia="Arial" w:hAnsi="Arial"/>
+          <w:b/>
+          <w:bCs/>
+          <w:sz w:val="24"/>
+          <w:szCs w:val="24"/>
+        </w:rPr>
+        <w:t xml:space="preserve">Relato simulado de Fernanda.</w:t>
+      </w:r>
+      <w:r>
+        <w:rPr>
+          <w:rFonts w:ascii="Arial" w:cs="Arial" w:eastAsia="Arial" w:hAnsi="Arial"/>
+          <w:sz w:val="24"/>
+          <w:szCs w:val="24"/>
+        </w:rPr>
+        <w:t xml:space="preserve"> Fernanda usaria apenas a busca e o relatório. Ao digitar cabo hdmi sem acento e em letras minúsculas, a tabela seria filtrada corretamente, pois a busca ignora acentos e diferenças entre maiúsculas e minúsculas. Para planejar a compra, a caixa Só itens para repor e a coluna Comprar do relatório responderiam diretamente à tarefa T5. A dificuldade antecipada foi a ausência de uma opção para exportar ou imprimir o relatório, o que a obrigaria a copiar os dados manualmente para enviar ao setor de compras.</w:t>
+      </w:r>
+    </w:p>
+    <w:p>
+      <w:pPr>
+        <w:spacing w:after="200" w:line="360"/>
+        <w:ind w:firstLine="709"/>
+        <w:jc w:val="both"/>
+      </w:pPr>
+      <w:r>
+        <w:rPr>
+          <w:rFonts w:ascii="Arial" w:cs="Arial" w:eastAsia="Arial" w:hAnsi="Arial"/>
+          <w:sz w:val="24"/>
+          <w:szCs w:val="24"/>
+        </w:rPr>
+        <w:t xml:space="preserve">O Quadro 4 consolida os problemas identificados no percurso. O preenchimento do campo de quantidade foi corrigido ainda durante o projeto: ao abrir o formulário, o valor inicial passa a vir selecionado, de modo que o valor digitado o substitui. Com isso, as tarefas T2 e T4 passaram a exigir uma tecla a menos, o que já está considerado na Tabela 3.</w:t>
+      </w:r>
+    </w:p>
+    <w:p>
+      <w:pPr>
+        <w:keepNext/>
+        <w:spacing w:after="80" w:before="240"/>
+        <w:jc w:val="center"/>
+      </w:pPr>
+      <w:r>
+        <w:rPr>
+          <w:rFonts w:ascii="Arial" w:cs="Arial" w:eastAsia="Arial" w:hAnsi="Arial"/>
+          <w:b/>
+          <w:bCs/>
+          <w:sz w:val="20"/>
+          <w:szCs w:val="20"/>
+        </w:rPr>
+        <w:t xml:space="preserve">Quadro 4 – Problemas identificados no percurso cognitivo</w:t>
+      </w:r>
+    </w:p>
+    <w:tbl>
+      <w:tblPr>
+        <w:tblW w:type="dxa" w:w="9072"/>
+        <w:jc w:val="center"/>
+        <w:tblBorders>
+          <w:top w:val="single" w:color="auto" w:sz="4"/>
+          <w:left w:val="single" w:color="auto" w:sz="4"/>
+          <w:bottom w:val="single" w:color="auto" w:sz="4"/>
+          <w:right w:val="single" w:color="auto" w:sz="4"/>
+          <w:insideH w:val="single" w:color="auto" w:sz="4"/>
+          <w:insideV w:val="single" w:color="auto" w:sz="4"/>
+        </w:tblBorders>
+      </w:tblPr>
+      <w:tblGrid>
+        <w:gridCol w:w="4309"/>
+        <w:gridCol w:w="1361"/>
+        <w:gridCol w:w="1247"/>
+        <w:gridCol w:w="2155"/>
+      </w:tblGrid>
+      <w:tr>
+        <w:trPr>
+          <w:tblHeader/>
+        </w:trPr>
+        <w:tc>
+          <w:tcPr>
+            <w:tcW w:type="dxa" w:w="4309"/>
+            <w:tcBorders>
+              <w:top w:val="single" w:color="000000" w:sz="6"/>
+              <w:left w:val="single" w:color="000000" w:sz="6"/>
+              <w:bottom w:val="single" w:color="000000" w:sz="6"/>
+              <w:right w:val="single" w:color="000000" w:sz="6"/>
+            </w:tcBorders>
+            <w:shd w:fill="E8EEF5" w:color="auto" w:val="clear"/>
+            <w:tcMar>
+              <w:top w:type="dxa" w:w="50"/>
+              <w:left w:type="dxa" w:w="80"/>
+              <w:bottom w:type="dxa" w:w="50"/>
+              <w:right w:type="dxa" w:w="80"/>
+            </w:tcMar>
+            <w:vAlign w:val="center"/>
+          </w:tcPr>
+          <w:p>
+            <w:pPr>
+              <w:keepNext/>
+              <w:jc w:val="left"/>
+            </w:pPr>
+            <w:r>
+              <w:rPr>
+                <w:rFonts w:ascii="Arial" w:cs="Arial" w:eastAsia="Arial" w:hAnsi="Arial"/>
+                <w:b/>
+                <w:bCs/>
+                <w:sz w:val="20"/>
+                <w:szCs w:val="20"/>
+              </w:rPr>
+              <w:t xml:space="preserve">Problema</w:t>
+            </w:r>
+          </w:p>
+        </w:tc>
+        <w:tc>
+          <w:tcPr>
+            <w:tcW w:type="dxa" w:w="1361"/>
+            <w:tcBorders>
+              <w:top w:val="single" w:color="000000" w:sz="6"/>
+              <w:left w:val="single" w:color="000000" w:sz="6"/>
+              <w:bottom w:val="single" w:color="000000" w:sz="6"/>
+              <w:right w:val="single" w:color="000000" w:sz="6"/>
+            </w:tcBorders>
+            <w:shd w:fill="E8EEF5" w:color="auto" w:val="clear"/>
+            <w:tcMar>
+              <w:top w:type="dxa" w:w="50"/>
+              <w:left w:type="dxa" w:w="80"/>
+              <w:bottom w:type="dxa" w:w="50"/>
+              <w:right w:type="dxa" w:w="80"/>
+            </w:tcMar>
+            <w:vAlign w:val="center"/>
+          </w:tcPr>
+          <w:p>
+            <w:pPr>
+              <w:keepNext/>
+              <w:jc w:val="center"/>
+            </w:pPr>
+            <w:r>
+              <w:rPr>
+                <w:rFonts w:ascii="Arial" w:cs="Arial" w:eastAsia="Arial" w:hAnsi="Arial"/>
+                <w:b/>
+                <w:bCs/>
+                <w:sz w:val="20"/>
+                <w:szCs w:val="20"/>
+              </w:rPr>
+              <w:t xml:space="preserve">Persona</w:t>
+            </w:r>
+          </w:p>
+        </w:tc>
+        <w:tc>
+          <w:tcPr>
+            <w:tcW w:type="dxa" w:w="1247"/>
+            <w:tcBorders>
+              <w:top w:val="single" w:color="000000" w:sz="6"/>
+              <w:left w:val="single" w:color="000000" w:sz="6"/>
+              <w:bottom w:val="single" w:color="000000" w:sz="6"/>
+              <w:right w:val="single" w:color="000000" w:sz="6"/>
+            </w:tcBorders>
+            <w:shd w:fill="E8EEF5" w:color="auto" w:val="clear"/>
+            <w:tcMar>
+              <w:top w:type="dxa" w:w="50"/>
+              <w:left w:type="dxa" w:w="80"/>
+              <w:bottom w:type="dxa" w:w="50"/>
+              <w:right w:type="dxa" w:w="80"/>
+            </w:tcMar>
+            <w:vAlign w:val="center"/>
+          </w:tcPr>
+          <w:p>
+            <w:pPr>
+              <w:keepNext/>
+              <w:jc w:val="center"/>
+            </w:pPr>
+            <w:r>
+              <w:rPr>
+                <w:rFonts w:ascii="Arial" w:cs="Arial" w:eastAsia="Arial" w:hAnsi="Arial"/>
+                <w:b/>
+                <w:bCs/>
+                <w:sz w:val="20"/>
+                <w:szCs w:val="20"/>
+              </w:rPr>
+              <w:t xml:space="preserve">Gravidade</w:t>
+            </w:r>
+          </w:p>
+        </w:tc>
+        <w:tc>
+          <w:tcPr>
+            <w:tcW w:type="dxa" w:w="2155"/>
+            <w:tcBorders>
+              <w:top w:val="single" w:color="000000" w:sz="6"/>
+              <w:left w:val="single" w:color="000000" w:sz="6"/>
+              <w:bottom w:val="single" w:color="000000" w:sz="6"/>
+              <w:right w:val="single" w:color="000000" w:sz="6"/>
+            </w:tcBorders>
+            <w:shd w:fill="E8EEF5" w:color="auto" w:val="clear"/>
+            <w:tcMar>
+              <w:top w:type="dxa" w:w="50"/>
+              <w:left w:type="dxa" w:w="80"/>
+              <w:bottom w:type="dxa" w:w="50"/>
+              <w:right w:type="dxa" w:w="80"/>
+            </w:tcMar>
+            <w:vAlign w:val="center"/>
+          </w:tcPr>
+          <w:p>
+            <w:pPr>
+              <w:keepNext/>
+              <w:jc w:val="center"/>
+            </w:pPr>
+            <w:r>
+              <w:rPr>
+                <w:rFonts w:ascii="Arial" w:cs="Arial" w:eastAsia="Arial" w:hAnsi="Arial"/>
+                <w:b/>
+                <w:bCs/>
+                <w:sz w:val="20"/>
+                <w:szCs w:val="20"/>
+              </w:rPr>
+              <w:t xml:space="preserve">Situação</w:t>
+            </w:r>
+          </w:p>
+        </w:tc>
+      </w:tr>
+      <w:tr>
+        <w:trPr>
+          <w:cantSplit/>
+        </w:trPr>
+        <w:tc>
+          <w:tcPr>
+            <w:tcW w:type="dxa" w:w="4309"/>
+            <w:tcBorders>
+              <w:top w:val="single" w:color="000000" w:sz="6"/>
+              <w:left w:val="single" w:color="000000" w:sz="6"/>
+              <w:bottom w:val="single" w:color="000000" w:sz="6"/>
+              <w:right w:val="single" w:color="000000" w:sz="6"/>
+            </w:tcBorders>
+            <w:tcMar>
+              <w:top w:type="dxa" w:w="50"/>
+              <w:left w:type="dxa" w:w="80"/>
+              <w:bottom w:type="dxa" w:w="50"/>
+              <w:right w:type="dxa" w:w="80"/>
+            </w:tcMar>
+            <w:vAlign w:val="center"/>
+          </w:tcPr>
+          <w:p>
+            <w:pPr>
+              <w:keepNext/>
+              <w:jc w:val="left"/>
+            </w:pPr>
+            <w:r>
+              <w:rPr>
+                <w:rFonts w:ascii="Arial" w:cs="Arial" w:eastAsia="Arial" w:hAnsi="Arial"/>
+                <w:b w:val="false"/>
+                <w:bCs w:val="false"/>
+                <w:sz w:val="20"/>
+                <w:szCs w:val="20"/>
+              </w:rPr>
+              <w:t xml:space="preserve">Valor inicial do campo de quantidade não é substituído ao digitar</w:t>
+            </w:r>
+          </w:p>
+        </w:tc>
+        <w:tc>
+          <w:tcPr>
+            <w:tcW w:type="dxa" w:w="1361"/>
+            <w:tcBorders>
+              <w:top w:val="single" w:color="000000" w:sz="6"/>
+              <w:left w:val="single" w:color="000000" w:sz="6"/>
+              <w:bottom w:val="single" w:color="000000" w:sz="6"/>
+              <w:right w:val="single" w:color="000000" w:sz="6"/>
+            </w:tcBorders>
+            <w:tcMar>
+              <w:top w:type="dxa" w:w="50"/>
+              <w:left w:type="dxa" w:w="80"/>
+              <w:bottom w:type="dxa" w:w="50"/>
+              <w:right w:type="dxa" w:w="80"/>
+            </w:tcMar>
+            <w:vAlign w:val="center"/>
+          </w:tcPr>
+          <w:p>
+            <w:pPr>
+              <w:keepNext/>
+              <w:jc w:val="left"/>
+            </w:pPr>
+            <w:r>
+              <w:rPr>
+                <w:rFonts w:ascii="Arial" w:cs="Arial" w:eastAsia="Arial" w:hAnsi="Arial"/>
+                <w:b w:val="false"/>
+                <w:bCs w:val="false"/>
+                <w:sz w:val="20"/>
+                <w:szCs w:val="20"/>
+              </w:rPr>
+              <w:t xml:space="preserve">Jorge</w:t>
+            </w:r>
+          </w:p>
+        </w:tc>
+        <w:tc>
+          <w:tcPr>
+            <w:tcW w:type="dxa" w:w="1247"/>
+            <w:tcBorders>
+              <w:top w:val="single" w:color="000000" w:sz="6"/>
+              <w:left w:val="single" w:color="000000" w:sz="6"/>
+              <w:bottom w:val="single" w:color="000000" w:sz="6"/>
+              <w:right w:val="single" w:color="000000" w:sz="6"/>
+            </w:tcBorders>
+            <w:tcMar>
+              <w:top w:type="dxa" w:w="50"/>
+              <w:left w:type="dxa" w:w="80"/>
+              <w:bottom w:type="dxa" w:w="50"/>
+              <w:right w:type="dxa" w:w="80"/>
+            </w:tcMar>
+            <w:vAlign w:val="center"/>
+          </w:tcPr>
+          <w:p>
+            <w:pPr>
+              <w:keepNext/>
+              <w:jc w:val="left"/>
+            </w:pPr>
+            <w:r>
+              <w:rPr>
+                <w:rFonts w:ascii="Arial" w:cs="Arial" w:eastAsia="Arial" w:hAnsi="Arial"/>
+                <w:b w:val="false"/>
+                <w:bCs w:val="false"/>
+                <w:sz w:val="20"/>
+                <w:szCs w:val="20"/>
+              </w:rPr>
+              <w:t xml:space="preserve">3</w:t>
+            </w:r>
+          </w:p>
+        </w:tc>
+        <w:tc>
+          <w:tcPr>
+            <w:tcW w:type="dxa" w:w="2155"/>
+            <w:tcBorders>
+              <w:top w:val="single" w:color="000000" w:sz="6"/>
+              <w:left w:val="single" w:color="000000" w:sz="6"/>
+              <w:bottom w:val="single" w:color="000000" w:sz="6"/>
+              <w:right w:val="single" w:color="000000" w:sz="6"/>
+            </w:tcBorders>
+            <w:tcMar>
+              <w:top w:type="dxa" w:w="50"/>
+              <w:left w:type="dxa" w:w="80"/>
+              <w:bottom w:type="dxa" w:w="50"/>
+              <w:right w:type="dxa" w:w="80"/>
+            </w:tcMar>
+            <w:vAlign w:val="center"/>
+          </w:tcPr>
+          <w:p>
+            <w:pPr>
+              <w:keepNext/>
+              <w:jc w:val="left"/>
+            </w:pPr>
+            <w:r>
+              <w:rPr>
+                <w:rFonts w:ascii="Arial" w:cs="Arial" w:eastAsia="Arial" w:hAnsi="Arial"/>
+                <w:b w:val="false"/>
+                <w:bCs w:val="false"/>
+                <w:sz w:val="20"/>
+                <w:szCs w:val="20"/>
+              </w:rPr>
+              <w:t xml:space="preserve">Corrigido</w:t>
+            </w:r>
+          </w:p>
+        </w:tc>
+      </w:tr>
+      <w:tr>
+        <w:trPr>
+          <w:cantSplit/>
+        </w:trPr>
+        <w:tc>
+          <w:tcPr>
+            <w:tcW w:type="dxa" w:w="4309"/>
+            <w:tcBorders>
+              <w:top w:val="single" w:color="000000" w:sz="6"/>
+              <w:left w:val="single" w:color="000000" w:sz="6"/>
+              <w:bottom w:val="single" w:color="000000" w:sz="6"/>
+              <w:right w:val="single" w:color="000000" w:sz="6"/>
+            </w:tcBorders>
+            <w:tcMar>
+              <w:top w:type="dxa" w:w="50"/>
+              <w:left w:type="dxa" w:w="80"/>
+              <w:bottom w:type="dxa" w:w="50"/>
+              <w:right w:type="dxa" w:w="80"/>
+            </w:tcMar>
+            <w:vAlign w:val="center"/>
+          </w:tcPr>
+          <w:p>
+            <w:pPr>
+              <w:keepNext/>
+              <w:jc w:val="left"/>
+            </w:pPr>
+            <w:r>
+              <w:rPr>
+                <w:rFonts w:ascii="Arial" w:cs="Arial" w:eastAsia="Arial" w:hAnsi="Arial"/>
+                <w:b w:val="false"/>
+                <w:bCs w:val="false"/>
+                <w:sz w:val="20"/>
+                <w:szCs w:val="20"/>
+              </w:rPr>
+              <w:t xml:space="preserve">Não há estorno de movimentação lançada por engano</w:t>
+            </w:r>
+          </w:p>
+        </w:tc>
+        <w:tc>
+          <w:tcPr>
+            <w:tcW w:type="dxa" w:w="1361"/>
+            <w:tcBorders>
+              <w:top w:val="single" w:color="000000" w:sz="6"/>
+              <w:left w:val="single" w:color="000000" w:sz="6"/>
+              <w:bottom w:val="single" w:color="000000" w:sz="6"/>
+              <w:right w:val="single" w:color="000000" w:sz="6"/>
+            </w:tcBorders>
+            <w:tcMar>
+              <w:top w:type="dxa" w:w="50"/>
+              <w:left w:type="dxa" w:w="80"/>
+              <w:bottom w:type="dxa" w:w="50"/>
+              <w:right w:type="dxa" w:w="80"/>
+            </w:tcMar>
+            <w:vAlign w:val="center"/>
+          </w:tcPr>
+          <w:p>
+            <w:pPr>
+              <w:keepNext/>
+              <w:jc w:val="left"/>
+            </w:pPr>
+            <w:r>
+              <w:rPr>
+                <w:rFonts w:ascii="Arial" w:cs="Arial" w:eastAsia="Arial" w:hAnsi="Arial"/>
+                <w:b w:val="false"/>
+                <w:bCs w:val="false"/>
+                <w:sz w:val="20"/>
+                <w:szCs w:val="20"/>
+              </w:rPr>
+              <w:t xml:space="preserve">Carla</w:t>
+            </w:r>
+          </w:p>
+        </w:tc>
+        <w:tc>
+          <w:tcPr>
+            <w:tcW w:type="dxa" w:w="1247"/>
+            <w:tcBorders>
+              <w:top w:val="single" w:color="000000" w:sz="6"/>
+              <w:left w:val="single" w:color="000000" w:sz="6"/>
+              <w:bottom w:val="single" w:color="000000" w:sz="6"/>
+              <w:right w:val="single" w:color="000000" w:sz="6"/>
+            </w:tcBorders>
+            <w:tcMar>
+              <w:top w:type="dxa" w:w="50"/>
+              <w:left w:type="dxa" w:w="80"/>
+              <w:bottom w:type="dxa" w:w="50"/>
+              <w:right w:type="dxa" w:w="80"/>
+            </w:tcMar>
+            <w:vAlign w:val="center"/>
+          </w:tcPr>
+          <w:p>
+            <w:pPr>
+              <w:keepNext/>
+              <w:jc w:val="left"/>
+            </w:pPr>
+            <w:r>
+              <w:rPr>
+                <w:rFonts w:ascii="Arial" w:cs="Arial" w:eastAsia="Arial" w:hAnsi="Arial"/>
+                <w:b w:val="false"/>
+                <w:bCs w:val="false"/>
+                <w:sz w:val="20"/>
+                <w:szCs w:val="20"/>
+              </w:rPr>
+              <w:t xml:space="preserve">3</w:t>
+            </w:r>
+          </w:p>
+        </w:tc>
+        <w:tc>
+          <w:tcPr>
+            <w:tcW w:type="dxa" w:w="2155"/>
+            <w:tcBorders>
+              <w:top w:val="single" w:color="000000" w:sz="6"/>
+              <w:left w:val="single" w:color="000000" w:sz="6"/>
+              <w:bottom w:val="single" w:color="000000" w:sz="6"/>
+              <w:right w:val="single" w:color="000000" w:sz="6"/>
+            </w:tcBorders>
+            <w:tcMar>
+              <w:top w:type="dxa" w:w="50"/>
+              <w:left w:type="dxa" w:w="80"/>
+              <w:bottom w:type="dxa" w:w="50"/>
+              <w:right w:type="dxa" w:w="80"/>
+            </w:tcMar>
+            <w:vAlign w:val="center"/>
+          </w:tcPr>
+          <w:p>
+            <w:pPr>
+              <w:keepNext/>
+              <w:jc w:val="left"/>
+            </w:pPr>
+            <w:r>
+              <w:rPr>
+                <w:rFonts w:ascii="Arial" w:cs="Arial" w:eastAsia="Arial" w:hAnsi="Arial"/>
+                <w:b w:val="false"/>
+                <w:bCs w:val="false"/>
+                <w:sz w:val="20"/>
+                <w:szCs w:val="20"/>
+              </w:rPr>
+              <w:t xml:space="preserve">Trabalho futuro</w:t>
+            </w:r>
+          </w:p>
+        </w:tc>
+      </w:tr>
+      <w:tr>
+        <w:trPr>
+          <w:cantSplit/>
+        </w:trPr>
+        <w:tc>
+          <w:tcPr>
+            <w:tcW w:type="dxa" w:w="4309"/>
+            <w:tcBorders>
+              <w:top w:val="single" w:color="000000" w:sz="6"/>
+              <w:left w:val="single" w:color="000000" w:sz="6"/>
+              <w:bottom w:val="single" w:color="000000" w:sz="6"/>
+              <w:right w:val="single" w:color="000000" w:sz="6"/>
+            </w:tcBorders>
+            <w:tcMar>
+              <w:top w:type="dxa" w:w="50"/>
+              <w:left w:type="dxa" w:w="80"/>
+              <w:bottom w:type="dxa" w:w="50"/>
+              <w:right w:type="dxa" w:w="80"/>
+            </w:tcMar>
+            <w:vAlign w:val="center"/>
+          </w:tcPr>
+          <w:p>
+            <w:pPr>
+              <w:keepNext/>
+              <w:jc w:val="left"/>
+            </w:pPr>
+            <w:r>
+              <w:rPr>
+                <w:rFonts w:ascii="Arial" w:cs="Arial" w:eastAsia="Arial" w:hAnsi="Arial"/>
+                <w:b w:val="false"/>
+                <w:bCs w:val="false"/>
+                <w:sz w:val="20"/>
+                <w:szCs w:val="20"/>
+              </w:rPr>
+              <w:t xml:space="preserve">Atalho Ctrl+S registra saída, contrariando a convenção de salvar</w:t>
+            </w:r>
+          </w:p>
+        </w:tc>
+        <w:tc>
+          <w:tcPr>
+            <w:tcW w:type="dxa" w:w="1361"/>
+            <w:tcBorders>
+              <w:top w:val="single" w:color="000000" w:sz="6"/>
+              <w:left w:val="single" w:color="000000" w:sz="6"/>
+              <w:bottom w:val="single" w:color="000000" w:sz="6"/>
+              <w:right w:val="single" w:color="000000" w:sz="6"/>
+            </w:tcBorders>
+            <w:tcMar>
+              <w:top w:type="dxa" w:w="50"/>
+              <w:left w:type="dxa" w:w="80"/>
+              <w:bottom w:type="dxa" w:w="50"/>
+              <w:right w:type="dxa" w:w="80"/>
+            </w:tcMar>
+            <w:vAlign w:val="center"/>
+          </w:tcPr>
+          <w:p>
+            <w:pPr>
+              <w:keepNext/>
+              <w:jc w:val="left"/>
+            </w:pPr>
+            <w:r>
+              <w:rPr>
+                <w:rFonts w:ascii="Arial" w:cs="Arial" w:eastAsia="Arial" w:hAnsi="Arial"/>
+                <w:b w:val="false"/>
+                <w:bCs w:val="false"/>
+                <w:sz w:val="20"/>
+                <w:szCs w:val="20"/>
+              </w:rPr>
+              <w:t xml:space="preserve">Carla</w:t>
+            </w:r>
+          </w:p>
+        </w:tc>
+        <w:tc>
+          <w:tcPr>
+            <w:tcW w:type="dxa" w:w="1247"/>
+            <w:tcBorders>
+              <w:top w:val="single" w:color="000000" w:sz="6"/>
+              <w:left w:val="single" w:color="000000" w:sz="6"/>
+              <w:bottom w:val="single" w:color="000000" w:sz="6"/>
+              <w:right w:val="single" w:color="000000" w:sz="6"/>
+            </w:tcBorders>
+            <w:tcMar>
+              <w:top w:type="dxa" w:w="50"/>
+              <w:left w:type="dxa" w:w="80"/>
+              <w:bottom w:type="dxa" w:w="50"/>
+              <w:right w:type="dxa" w:w="80"/>
+            </w:tcMar>
+            <w:vAlign w:val="center"/>
+          </w:tcPr>
+          <w:p>
+            <w:pPr>
+              <w:keepNext/>
+              <w:jc w:val="left"/>
+            </w:pPr>
+            <w:r>
+              <w:rPr>
+                <w:rFonts w:ascii="Arial" w:cs="Arial" w:eastAsia="Arial" w:hAnsi="Arial"/>
+                <w:b w:val="false"/>
+                <w:bCs w:val="false"/>
+                <w:sz w:val="20"/>
+                <w:szCs w:val="20"/>
+              </w:rPr>
+              <w:t xml:space="preserve">2</w:t>
+            </w:r>
+          </w:p>
+        </w:tc>
+        <w:tc>
+          <w:tcPr>
+            <w:tcW w:type="dxa" w:w="2155"/>
+            <w:tcBorders>
+              <w:top w:val="single" w:color="000000" w:sz="6"/>
+              <w:left w:val="single" w:color="000000" w:sz="6"/>
+              <w:bottom w:val="single" w:color="000000" w:sz="6"/>
+              <w:right w:val="single" w:color="000000" w:sz="6"/>
+            </w:tcBorders>
+            <w:tcMar>
+              <w:top w:type="dxa" w:w="50"/>
+              <w:left w:type="dxa" w:w="80"/>
+              <w:bottom w:type="dxa" w:w="50"/>
+              <w:right w:type="dxa" w:w="80"/>
+            </w:tcMar>
+            <w:vAlign w:val="center"/>
+          </w:tcPr>
+          <w:p>
+            <w:pPr>
+              <w:keepNext/>
+              <w:jc w:val="left"/>
+            </w:pPr>
+            <w:r>
+              <w:rPr>
+                <w:rFonts w:ascii="Arial" w:cs="Arial" w:eastAsia="Arial" w:hAnsi="Arial"/>
+                <w:b w:val="false"/>
+                <w:bCs w:val="false"/>
+                <w:sz w:val="20"/>
+                <w:szCs w:val="20"/>
+              </w:rPr>
+              <w:t xml:space="preserve">Trabalho futuro</w:t>
+            </w:r>
+          </w:p>
+        </w:tc>
+      </w:tr>
+      <w:tr>
+        <w:trPr>
+          <w:cantSplit/>
+        </w:trPr>
+        <w:tc>
+          <w:tcPr>
+            <w:tcW w:type="dxa" w:w="4309"/>
+            <w:tcBorders>
+              <w:top w:val="single" w:color="000000" w:sz="6"/>
+              <w:left w:val="single" w:color="000000" w:sz="6"/>
+              <w:bottom w:val="single" w:color="000000" w:sz="6"/>
+              <w:right w:val="single" w:color="000000" w:sz="6"/>
+            </w:tcBorders>
+            <w:tcMar>
+              <w:top w:type="dxa" w:w="50"/>
+              <w:left w:type="dxa" w:w="80"/>
+              <w:bottom w:type="dxa" w:w="50"/>
+              <w:right w:type="dxa" w:w="80"/>
+            </w:tcMar>
+            <w:vAlign w:val="center"/>
+          </w:tcPr>
+          <w:p>
+            <w:pPr>
+              <w:keepNext/>
+              <w:jc w:val="left"/>
+            </w:pPr>
+            <w:r>
+              <w:rPr>
+                <w:rFonts w:ascii="Arial" w:cs="Arial" w:eastAsia="Arial" w:hAnsi="Arial"/>
+                <w:b w:val="false"/>
+                <w:bCs w:val="false"/>
+                <w:sz w:val="20"/>
+                <w:szCs w:val="20"/>
+              </w:rPr>
+              <w:t xml:space="preserve">Relatório não pode ser exportado nem impresso</w:t>
+            </w:r>
+          </w:p>
+        </w:tc>
+        <w:tc>
+          <w:tcPr>
+            <w:tcW w:type="dxa" w:w="1361"/>
+            <w:tcBorders>
+              <w:top w:val="single" w:color="000000" w:sz="6"/>
+              <w:left w:val="single" w:color="000000" w:sz="6"/>
+              <w:bottom w:val="single" w:color="000000" w:sz="6"/>
+              <w:right w:val="single" w:color="000000" w:sz="6"/>
+            </w:tcBorders>
+            <w:tcMar>
+              <w:top w:type="dxa" w:w="50"/>
+              <w:left w:type="dxa" w:w="80"/>
+              <w:bottom w:type="dxa" w:w="50"/>
+              <w:right w:type="dxa" w:w="80"/>
+            </w:tcMar>
+            <w:vAlign w:val="center"/>
+          </w:tcPr>
+          <w:p>
+            <w:pPr>
+              <w:keepNext/>
+              <w:jc w:val="left"/>
+            </w:pPr>
+            <w:r>
+              <w:rPr>
+                <w:rFonts w:ascii="Arial" w:cs="Arial" w:eastAsia="Arial" w:hAnsi="Arial"/>
+                <w:b w:val="false"/>
+                <w:bCs w:val="false"/>
+                <w:sz w:val="20"/>
+                <w:szCs w:val="20"/>
+              </w:rPr>
+              <w:t xml:space="preserve">Fernanda</w:t>
+            </w:r>
+          </w:p>
+        </w:tc>
+        <w:tc>
+          <w:tcPr>
+            <w:tcW w:type="dxa" w:w="1247"/>
+            <w:tcBorders>
+              <w:top w:val="single" w:color="000000" w:sz="6"/>
+              <w:left w:val="single" w:color="000000" w:sz="6"/>
+              <w:bottom w:val="single" w:color="000000" w:sz="6"/>
+              <w:right w:val="single" w:color="000000" w:sz="6"/>
+            </w:tcBorders>
+            <w:tcMar>
+              <w:top w:type="dxa" w:w="50"/>
+              <w:left w:type="dxa" w:w="80"/>
+              <w:bottom w:type="dxa" w:w="50"/>
+              <w:right w:type="dxa" w:w="80"/>
+            </w:tcMar>
+            <w:vAlign w:val="center"/>
+          </w:tcPr>
+          <w:p>
+            <w:pPr>
+              <w:keepNext/>
+              <w:jc w:val="left"/>
+            </w:pPr>
+            <w:r>
+              <w:rPr>
+                <w:rFonts w:ascii="Arial" w:cs="Arial" w:eastAsia="Arial" w:hAnsi="Arial"/>
+                <w:b w:val="false"/>
+                <w:bCs w:val="false"/>
+                <w:sz w:val="20"/>
+                <w:szCs w:val="20"/>
+              </w:rPr>
+              <w:t xml:space="preserve">1</w:t>
+            </w:r>
+          </w:p>
+        </w:tc>
+        <w:tc>
+          <w:tcPr>
+            <w:tcW w:type="dxa" w:w="2155"/>
+            <w:tcBorders>
+              <w:top w:val="single" w:color="000000" w:sz="6"/>
+              <w:left w:val="single" w:color="000000" w:sz="6"/>
+              <w:bottom w:val="single" w:color="000000" w:sz="6"/>
+              <w:right w:val="single" w:color="000000" w:sz="6"/>
+            </w:tcBorders>
+            <w:tcMar>
+              <w:top w:type="dxa" w:w="50"/>
+              <w:left w:type="dxa" w:w="80"/>
+              <w:bottom w:type="dxa" w:w="50"/>
+              <w:right w:type="dxa" w:w="80"/>
+            </w:tcMar>
+            <w:vAlign w:val="center"/>
+          </w:tcPr>
+          <w:p>
+            <w:pPr>
+              <w:keepNext/>
+              <w:jc w:val="left"/>
+            </w:pPr>
+            <w:r>
+              <w:rPr>
+                <w:rFonts w:ascii="Arial" w:cs="Arial" w:eastAsia="Arial" w:hAnsi="Arial"/>
+                <w:b w:val="false"/>
+                <w:bCs w:val="false"/>
+                <w:sz w:val="20"/>
+                <w:szCs w:val="20"/>
+              </w:rPr>
+              <w:t xml:space="preserve">Trabalho futuro</w:t>
+            </w:r>
+          </w:p>
+        </w:tc>
+      </w:tr>
+      <w:tr>
+        <w:trPr>
+          <w:cantSplit/>
+        </w:trPr>
+        <w:tc>
+          <w:tcPr>
+            <w:tcW w:type="dxa" w:w="4309"/>
+            <w:tcBorders>
+              <w:top w:val="single" w:color="000000" w:sz="6"/>
+              <w:left w:val="single" w:color="000000" w:sz="6"/>
+              <w:bottom w:val="single" w:color="000000" w:sz="6"/>
+              <w:right w:val="single" w:color="000000" w:sz="6"/>
+            </w:tcBorders>
+            <w:tcMar>
+              <w:top w:type="dxa" w:w="50"/>
+              <w:left w:type="dxa" w:w="80"/>
+              <w:bottom w:type="dxa" w:w="50"/>
+              <w:right w:type="dxa" w:w="80"/>
+            </w:tcMar>
+            <w:vAlign w:val="center"/>
+          </w:tcPr>
+          <w:p>
+            <w:pPr>
+              <w:keepNext w:val="false"/>
+              <w:jc w:val="left"/>
+            </w:pPr>
+            <w:r>
+              <w:rPr>
+                <w:rFonts w:ascii="Arial" w:cs="Arial" w:eastAsia="Arial" w:hAnsi="Arial"/>
+                <w:b w:val="false"/>
+                <w:bCs w:val="false"/>
+                <w:sz w:val="20"/>
+                <w:szCs w:val="20"/>
+              </w:rPr>
+              <w:t xml:space="preserve">Setas nos botões de entrada e saída podem gerar hesitação</w:t>
+            </w:r>
+          </w:p>
+        </w:tc>
+        <w:tc>
+          <w:tcPr>
+            <w:tcW w:type="dxa" w:w="1361"/>
+            <w:tcBorders>
+              <w:top w:val="single" w:color="000000" w:sz="6"/>
+              <w:left w:val="single" w:color="000000" w:sz="6"/>
+              <w:bottom w:val="single" w:color="000000" w:sz="6"/>
+              <w:right w:val="single" w:color="000000" w:sz="6"/>
+            </w:tcBorders>
+            <w:tcMar>
+              <w:top w:type="dxa" w:w="50"/>
+              <w:left w:type="dxa" w:w="80"/>
+              <w:bottom w:type="dxa" w:w="50"/>
+              <w:right w:type="dxa" w:w="80"/>
+            </w:tcMar>
+            <w:vAlign w:val="center"/>
+          </w:tcPr>
+          <w:p>
+            <w:pPr>
+              <w:keepNext w:val="false"/>
+              <w:jc w:val="left"/>
+            </w:pPr>
+            <w:r>
+              <w:rPr>
+                <w:rFonts w:ascii="Arial" w:cs="Arial" w:eastAsia="Arial" w:hAnsi="Arial"/>
+                <w:b w:val="false"/>
+                <w:bCs w:val="false"/>
+                <w:sz w:val="20"/>
+                <w:szCs w:val="20"/>
+              </w:rPr>
+              <w:t xml:space="preserve">Jorge</w:t>
+            </w:r>
+          </w:p>
+        </w:tc>
+        <w:tc>
+          <w:tcPr>
+            <w:tcW w:type="dxa" w:w="1247"/>
+            <w:tcBorders>
+              <w:top w:val="single" w:color="000000" w:sz="6"/>
+              <w:left w:val="single" w:color="000000" w:sz="6"/>
+              <w:bottom w:val="single" w:color="000000" w:sz="6"/>
+              <w:right w:val="single" w:color="000000" w:sz="6"/>
+            </w:tcBorders>
+            <w:tcMar>
+              <w:top w:type="dxa" w:w="50"/>
+              <w:left w:type="dxa" w:w="80"/>
+              <w:bottom w:type="dxa" w:w="50"/>
+              <w:right w:type="dxa" w:w="80"/>
+            </w:tcMar>
+            <w:vAlign w:val="center"/>
+          </w:tcPr>
+          <w:p>
+            <w:pPr>
+              <w:keepNext w:val="false"/>
+              <w:jc w:val="left"/>
+            </w:pPr>
+            <w:r>
+              <w:rPr>
+                <w:rFonts w:ascii="Arial" w:cs="Arial" w:eastAsia="Arial" w:hAnsi="Arial"/>
+                <w:b w:val="false"/>
+                <w:bCs w:val="false"/>
+                <w:sz w:val="20"/>
+                <w:szCs w:val="20"/>
+              </w:rPr>
+              <w:t xml:space="preserve">1</w:t>
+            </w:r>
+          </w:p>
+        </w:tc>
+        <w:tc>
+          <w:tcPr>
+            <w:tcW w:type="dxa" w:w="2155"/>
+            <w:tcBorders>
+              <w:top w:val="single" w:color="000000" w:sz="6"/>
+              <w:left w:val="single" w:color="000000" w:sz="6"/>
+              <w:bottom w:val="single" w:color="000000" w:sz="6"/>
+              <w:right w:val="single" w:color="000000" w:sz="6"/>
+            </w:tcBorders>
+            <w:tcMar>
+              <w:top w:type="dxa" w:w="50"/>
+              <w:left w:type="dxa" w:w="80"/>
+              <w:bottom w:type="dxa" w:w="50"/>
+              <w:right w:type="dxa" w:w="80"/>
+            </w:tcMar>
+            <w:vAlign w:val="center"/>
+          </w:tcPr>
+          <w:p>
+            <w:pPr>
+              <w:keepNext w:val="false"/>
+              <w:jc w:val="left"/>
+            </w:pPr>
+            <w:r>
+              <w:rPr>
+                <w:rFonts w:ascii="Arial" w:cs="Arial" w:eastAsia="Arial" w:hAnsi="Arial"/>
+                <w:b w:val="false"/>
+                <w:bCs w:val="false"/>
+                <w:sz w:val="20"/>
+                <w:szCs w:val="20"/>
+              </w:rPr>
+              <w:t xml:space="preserve">Trabalho futuro</w:t>
+            </w:r>
+          </w:p>
+        </w:tc>
+      </w:tr>
+    </w:tbl>
+    <w:p>
+      <w:pPr>
+        <w:spacing w:after="280" w:before="60"/>
+        <w:jc w:val="center"/>
+      </w:pPr>
+      <w:r>
+        <w:rPr>
+          <w:rFonts w:ascii="Arial" w:cs="Arial" w:eastAsia="Arial" w:hAnsi="Arial"/>
+          <w:sz w:val="20"/>
+          <w:szCs w:val="20"/>
+        </w:rPr>
+        <w:t xml:space="preserve">Fonte: Autor, 2026. Gravidade conforme Nielsen (1993).</w:t>
+      </w:r>
+    </w:p>
+    <w:p>
+      <w:pPr>
         <w:pStyle w:val="Heading1"/>
         <w:pageBreakBefore/>
         <w:spacing w:after="360" w:before="0" w:line="360"/>
@@ -10549,7 +12140,7 @@
           <w:sz w:val="24"/>
           <w:szCs w:val="24"/>
         </w:rPr>
-        <w:t xml:space="preserve">O trabalho apresenta limitações. A ordenação por inserção, mantida por ser objeto de estudo da disciplina, tem complexidade quadrática e deixaria de atender à meta acima de aproximadamente 1.500 itens. O armazenamento em arquivo JSON, regravado a cada alteração, torna as operações progressivamente mais lentas à medida que o histórico cresce e não permite o uso simultâneo por mais de um computador. Por fim, a avaliação de usabilidade foi analítica, baseada em heurísticas e no modelo KLM, e não mediu a percepção de usuários reais.</w:t>
+        <w:t xml:space="preserve">O trabalho apresenta limitações. A ordenação por inserção, mantida por ser objeto de estudo da disciplina, tem complexidade quadrática e deixaria de atender à meta acima de aproximadamente 1.500 itens. O armazenamento em arquivo JSON, regravado a cada alteração, torna as operações progressivamente mais lentas à medida que o histórico cresce e não permite o uso simultâneo por mais de um computador. Por fim, a avaliação de usabilidade foi analítica, baseada em heurísticas, no modelo KLM e em relatos simulados com personas, e não mediu a percepção de usuários reais; os problemas antecipados nos relatos precisam ser confirmados com a equipe do hospital.</w:t>
       </w:r>
     </w:p>
     <w:p>
@@ -10564,7 +12155,7 @@
           <w:sz w:val="24"/>
           <w:szCs w:val="24"/>
         </w:rPr>
-        <w:t xml:space="preserve">Como continuidade, propõe-se: aplicar o roteiro de teste com usuários e o questionário SUS com a equipe do hospital, interpretando as notas pelas faixas de Bangor, Kortum e Miller (2009), com ao menos cinco participantes, número que segundo Nielsen e Landauer (1993) já revela a maior parte dos problemas de usabilidade; substituir o arquivo JSON por um banco de dados SQLite; implementar o estorno de movimentações, a edição de itens e uma ajuda integrada, corrigindo os problemas da avaliação heurística; e, futuramente, disponibilizar uma versão web, reaproveitando o núcleo de regras de negócio já separado da interface.</w:t>
+        <w:t xml:space="preserve">Como continuidade, propõe-se: aplicar o roteiro de teste com usuários e o questionário SUS com a equipe do hospital, interpretando as notas pelas faixas de Bangor, Kortum e Miller (2009), com ao menos cinco participantes, número que segundo Nielsen e Landauer (1993) já revela a maior parte dos problemas de usabilidade; substituir o arquivo JSON por um banco de dados SQLite; implementar o estorno de movimentações, a edição de itens, a exportação do relatório e uma ajuda integrada, corrigindo os problemas da avaliação heurística e do percurso cognitivo; e, futuramente, disponibilizar uma versão web, reaproveitando o núcleo de regras de negócio já separado da interface.</w:t>
       </w:r>
     </w:p>
     <w:p>
@@ -10746,6 +12337,38 @@
           <w:sz w:val="24"/>
           <w:szCs w:val="24"/>
         </w:rPr>
+        <w:t xml:space="preserve">COOPER, A. </w:t>
+      </w:r>
+      <w:r>
+        <w:rPr>
+          <w:rFonts w:ascii="Arial" w:cs="Arial" w:eastAsia="Arial" w:hAnsi="Arial"/>
+          <w:b/>
+          <w:bCs/>
+          <w:sz w:val="24"/>
+          <w:szCs w:val="24"/>
+        </w:rPr>
+        <w:t xml:space="preserve">The inmates are running the asylum</w:t>
+      </w:r>
+      <w:r>
+        <w:rPr>
+          <w:rFonts w:ascii="Arial" w:cs="Arial" w:eastAsia="Arial" w:hAnsi="Arial"/>
+          <w:sz w:val="24"/>
+          <w:szCs w:val="24"/>
+        </w:rPr>
+        <w:t xml:space="preserve">: why high-tech products drive us crazy and how to restore the sanity. Indianapolis: Sams, 1999.</w:t>
+      </w:r>
+    </w:p>
+    <w:p>
+      <w:pPr>
+        <w:spacing w:after="240" w:line="240"/>
+        <w:jc w:val="left"/>
+      </w:pPr>
+      <w:r>
+        <w:rPr>
+          <w:rFonts w:ascii="Arial" w:cs="Arial" w:eastAsia="Arial" w:hAnsi="Arial"/>
+          <w:sz w:val="24"/>
+          <w:szCs w:val="24"/>
+        </w:rPr>
         <w:t xml:space="preserve">CORMEN, T. H. </w:t>
       </w:r>
       <w:r>
@@ -11107,6 +12730,74 @@
           <w:szCs w:val="24"/>
         </w:rPr>
         <w:t xml:space="preserve">]: PSF, 2026. Disponível em: https://docs.python.org/3/library/. Acesso em: 15 out. 2026.</w:t>
+      </w:r>
+    </w:p>
+    <w:p>
+      <w:pPr>
+        <w:spacing w:after="240" w:line="240"/>
+        <w:jc w:val="left"/>
+      </w:pPr>
+      <w:r>
+        <w:rPr>
+          <w:rFonts w:ascii="Arial" w:cs="Arial" w:eastAsia="Arial" w:hAnsi="Arial"/>
+          <w:sz w:val="24"/>
+          <w:szCs w:val="24"/>
+        </w:rPr>
+        <w:t xml:space="preserve">WHARTON, C. </w:t>
+      </w:r>
+      <w:r>
+        <w:rPr>
+          <w:rFonts w:ascii="Arial" w:cs="Arial" w:eastAsia="Arial" w:hAnsi="Arial"/>
+          <w:i/>
+          <w:iCs/>
+          <w:sz w:val="24"/>
+          <w:szCs w:val="24"/>
+        </w:rPr>
+        <w:t xml:space="preserve">et al</w:t>
+      </w:r>
+      <w:r>
+        <w:rPr>
+          <w:rFonts w:ascii="Arial" w:cs="Arial" w:eastAsia="Arial" w:hAnsi="Arial"/>
+          <w:sz w:val="24"/>
+          <w:szCs w:val="24"/>
+        </w:rPr>
+        <w:t xml:space="preserve">. The cognitive walkthrough method: a practitioner's guide. </w:t>
+      </w:r>
+      <w:r>
+        <w:rPr>
+          <w:rFonts w:ascii="Arial" w:cs="Arial" w:eastAsia="Arial" w:hAnsi="Arial"/>
+          <w:i/>
+          <w:iCs/>
+          <w:sz w:val="24"/>
+          <w:szCs w:val="24"/>
+        </w:rPr>
+        <w:t xml:space="preserve">In</w:t>
+      </w:r>
+      <w:r>
+        <w:rPr>
+          <w:rFonts w:ascii="Arial" w:cs="Arial" w:eastAsia="Arial" w:hAnsi="Arial"/>
+          <w:sz w:val="24"/>
+          <w:szCs w:val="24"/>
+        </w:rPr>
+        <w:t xml:space="preserve">: NIELSEN, J.; MACK, R. L. (ed.). </w:t>
+      </w:r>
+      <w:r>
+        <w:rPr>
+          <w:rFonts w:ascii="Arial" w:cs="Arial" w:eastAsia="Arial" w:hAnsi="Arial"/>
+          <w:b/>
+          <w:bCs/>
+          <w:sz w:val="24"/>
+          <w:szCs w:val="24"/>
+        </w:rPr>
+        <w:t xml:space="preserve">Usability inspection methods</w:t>
+      </w:r>
+      <w:r>
+        <w:rPr>
+          <w:rFonts w:ascii="Arial" w:cs="Arial" w:eastAsia="Arial" w:hAnsi="Arial"/>
+          <w:sz w:val="24"/>
+          <w:szCs w:val="24"/>
+        </w:rPr>
+        <w:t xml:space="preserve">. New York: John Wiley &amp; Sons, 1994. p. 105-140.</w:t>
       </w:r>
     </w:p>
     <w:p>

</xml_diff>

<commit_message>
Preenche RA e turma na capa do relatório
Co-Authored-By: Claude Opus 5.5 <noreply@anthropic.com>
Claude-Session: https://claude.ai/code/session_01Ra395WfUptUjwP3YxcgdmB
</commit_message>
<xml_diff>
--- a/relatorio/Relatorio_Projeto_Integrador.docx
+++ b/relatorio/Relatorio_Projeto_Integrador.docx
@@ -75,35 +75,7 @@
           <w:sz w:val="24"/>
           <w:szCs w:val="24"/>
         </w:rPr>
-        <w:t xml:space="preserve">RA: </w:t>
-      </w:r>
-      <w:r>
-        <w:rPr>
-          <w:rFonts w:ascii="Arial" w:cs="Arial" w:eastAsia="Arial" w:hAnsi="Arial"/>
-          <w:sz w:val="24"/>
-          <w:szCs w:val="24"/>
-          <w:highlight w:val="yellow"/>
-          <w:highlightCs w:val="yellow"/>
-        </w:rPr>
-        <w:t xml:space="preserve">[preencher]</w:t>
-      </w:r>
-      <w:r>
-        <w:rPr>
-          <w:rFonts w:ascii="Arial" w:cs="Arial" w:eastAsia="Arial" w:hAnsi="Arial"/>
-          <w:sz w:val="24"/>
-          <w:szCs w:val="24"/>
-        </w:rPr>
-        <w:t xml:space="preserve">   Turma: </w:t>
-      </w:r>
-      <w:r>
-        <w:rPr>
-          <w:rFonts w:ascii="Arial" w:cs="Arial" w:eastAsia="Arial" w:hAnsi="Arial"/>
-          <w:sz w:val="24"/>
-          <w:szCs w:val="24"/>
-          <w:highlight w:val="yellow"/>
-          <w:highlightCs w:val="yellow"/>
-        </w:rPr>
-        <w:t xml:space="preserve">[preencher]</w:t>
+        <w:t xml:space="preserve">RA: 5742447   Turma: B</w:t>
       </w:r>
     </w:p>
     <w:p>

</xml_diff>